<commit_message>
Documente les 3 bugs de l'installateur decouverts sur un second poste
Elevation UAC manquante, mismatch de pilote psycopg2/psycopg, parametre
altitude invalide sur le modele Station - ajoutes a la section 4.11
Packaging et distribution.
</commit_message>
<xml_diff>
--- a/Rapport_Stage/Rapport de stage.docx
+++ b/Rapport_Stage/Rapport de stage.docx
@@ -16457,6 +16457,23 @@
           <w:lang w:val="fr-FR"/>
         </w:rPr>
         <w:t xml:space="preserve"> utilisés en développement, afin d'éviter toute duplication entre les deux usages.</w:t>
+      </w:r>
+    </w:p>
+    <w:p>
+      <w:pPr>
+        <w:spacing w:line="312" w:lineRule="auto"/>
+        <w:jc w:val="both"/>
+        <w:rPr>
+          <w:rFonts w:asciiTheme="majorBidi" w:hAnsiTheme="majorBidi" w:cstheme="majorBidi"/>
+          <w:lang w:val="fr-FR"/>
+        </w:rPr>
+      </w:pPr>
+      <w:r>
+        <w:rPr>
+          <w:rFonts w:asciiTheme="majorBidi" w:hAnsiTheme="majorBidi" w:cstheme="majorBidi"/>
+          <w:lang w:val="fr-FR"/>
+        </w:rPr>
+        <w:t>Cet installateur a lui-même révélé trois anomalies lors d'un test sur un second poste, distinct de celui de développement — l'occasion de constater l'intérêt de tester un déploiement sur une machine réellement différente plutôt que de se fier au seul poste habituel. Premièrement, l'installation silencieuse de PostgreSQL nécessitant les droits administrateur, l'exécutable échouait sans manifeste avec « l'opération nécessite une élévation » plutôt que de déclencher l'invite UAC attendue : corrigé en activant l'option uac_admin de PyInstaller. Deuxièmement, le fichier .env généré par l'installateur spécifiait une chaîne de connexion sans préciser le pilote (postgresql://...), que SQLAlchemy interprète par défaut comme psycopg2 — non installé, le projet utilisant psycopg (version 3) — provoquant un ModuleNotFoundError dès la première connexion : corrigé en précisant explicitement le pilote (postgresql+psycopg://...). Troisièmement, la fonction d'initialisation des stations transmettait un paramètre altitude au modèle Station, qui ne possède pas cette colonne (héritée d'une version antérieure du modèle de données), interrompant cette étape après la création réussie du schéma et du compte administrateur. La conception idempotente de cette fonction d'initialisation a permis de reprendre l'installation sans dupliquer ce qui avait déjà été créé, une fois ces trois anomalies corrigées.</w:t>
       </w:r>
     </w:p>
     <w:p>

</xml_diff>